<commit_message>
Change Organization Type, NAICS Sector, NAICS Subsector to not required on client intake form
</commit_message>
<xml_diff>
--- a/PRDs/CBM-PRD-Forms.docx
+++ b/PRDs/CBM-PRD-Forms.docx
@@ -1430,7 +1430,7 @@
                 <w:sz w:val="20"/>
                 <w:szCs w:val="20"/>
               </w:rPr>
-              <w:t xml:space="preserve">Yes</w:t>
+              <w:t xml:space="preserve">No</w:t>
             </w:r>
           </w:p>
         </w:tc>
@@ -1606,7 +1606,7 @@
                 <w:sz w:val="20"/>
                 <w:szCs w:val="20"/>
               </w:rPr>
-              <w:t xml:space="preserve">Yes</w:t>
+              <w:t xml:space="preserve">No</w:t>
             </w:r>
           </w:p>
         </w:tc>
@@ -1694,7 +1694,7 @@
                 <w:sz w:val="20"/>
                 <w:szCs w:val="20"/>
               </w:rPr>
-              <w:t xml:space="preserve">Yes</w:t>
+              <w:t xml:space="preserve">No</w:t>
             </w:r>
           </w:p>
         </w:tc>

</xml_diff>

<commit_message>
Select Gravity Forms as form engine; remove plugin TBD references
</commit_message>
<xml_diff>
--- a/PRDs/CBM-PRD-Forms.docx
+++ b/PRDs/CBM-PRD-Forms.docx
@@ -69,7 +69,7 @@
           <w:sz w:val="22"/>
           <w:szCs w:val="22"/>
         </w:rPr>
-        <w:t xml:space="preserve">This PRD defines the two public-facing intake forms hosted on the CBM WordPress website. Each form collects applicant data and posts it to EspoCRM via the REST API, automatically creating the appropriate CRM records. The forms are built using a WordPress form plugin (Gravity Forms or WPForms).</w:t>
+        <w:t xml:space="preserve">This PRD defines the two public-facing intake forms hosted on the CBM WordPress website. Each form collects applicant data and posts it to EspoCRM via the REST API, automatically creating the appropriate CRM records. The forms are built using Gravity Forms.</w:t>
       </w:r>
     </w:p>
     <w:p>
@@ -132,22 +132,6 @@
       </w:r>
     </w:p>
     <w:p>
-      <w:pPr>
-        <w:spacing w:after="120"/>
-      </w:pPr>
-      <w:r>
-        <w:rPr>
-          <w:rFonts w:ascii="Arial" w:cs="Arial" w:eastAsia="Arial" w:hAnsi="Arial"/>
-          <w:i/>
-          <w:iCs/>
-          <w:color w:val="555555"/>
-          <w:sz w:val="20"/>
-          <w:szCs w:val="20"/>
-        </w:rPr>
-        <w:t xml:space="preserve">Note: WordPress form plugin selection (Gravity Forms vs. WPForms) is To Be Determined. Both support REST API webhooks and are compatible with the EspoCRM integration approach. Final selection will be made prior to site build.</w:t>
-      </w:r>
-    </w:p>
-    <w:p>
       <w:r>
         <w:t xml:space="preserve"/>
       </w:r>
@@ -195,7 +179,7 @@
           <w:sz w:val="22"/>
           <w:szCs w:val="22"/>
         </w:rPr>
-        <w:t xml:space="preserve">The WordPress form plugin captures the submitted data</w:t>
+        <w:t xml:space="preserve">The Gravity Forms plugin captures the submitted data</w:t>
       </w:r>
     </w:p>
     <w:p>
@@ -267,7 +251,7 @@
           <w:sz w:val="22"/>
           <w:szCs w:val="22"/>
         </w:rPr>
-        <w:t xml:space="preserve">EspoCRM REST API authentication uses an API key scoped to a dedicated integration user account. Field mapping between form fields and EspoCRM entity fields is configured within the form plugin’s webhook/integration settings.</w:t>
+        <w:t xml:space="preserve">EspoCRM REST API authentication uses an API key scoped to a dedicated integration user account. Field mapping between form fields and EspoCRM entity fields is configured within Gravity Forms’ webhook/integration settings.</w:t>
       </w:r>
     </w:p>
     <w:p>
@@ -3714,24 +3698,6 @@
           <w:szCs w:val="32"/>
         </w:rPr>
         <w:t xml:space="preserve">5. Open Questions</w:t>
-      </w:r>
-    </w:p>
-    <w:p>
-      <w:pPr>
-        <w:pStyle w:val="ListParagraph"/>
-        <w:numPr>
-          <w:ilvl w:val="0"/>
-          <w:numId w:val="2"/>
-        </w:numPr>
-        <w:spacing w:after="60"/>
-      </w:pPr>
-      <w:r>
-        <w:rPr>
-          <w:rFonts w:ascii="Arial" w:cs="Arial" w:eastAsia="Arial" w:hAnsi="Arial"/>
-          <w:sz w:val="22"/>
-          <w:szCs w:val="22"/>
-        </w:rPr>
-        <w:t xml:space="preserve">WordPress form plugin selection: Gravity Forms vs. WPForms — to be decided prior to site build</w:t>
       </w:r>
     </w:p>
     <w:p>

</xml_diff>